<commit_message>
Adding of 50% doc
</commit_message>
<xml_diff>
--- a/Contx - Proposal Form.docx
+++ b/Contx - Proposal Form.docx
@@ -67,12 +67,12 @@
             <wp:extent cx="733529" cy="730743"/>
             <wp:effectExtent b="0" l="0" r="0" t="0"/>
             <wp:wrapNone/>
-            <wp:docPr id="2" name="image2.png"/>
+            <wp:docPr id="2" name="image1.png"/>
             <a:graphic>
               <a:graphicData uri="http://schemas.openxmlformats.org/drawingml/2006/picture">
                 <pic:pic>
                   <pic:nvPicPr>
-                    <pic:cNvPr id="0" name="image2.png"/>
+                    <pic:cNvPr id="0" name="image1.png"/>
                     <pic:cNvPicPr preferRelativeResize="0"/>
                   </pic:nvPicPr>
                   <pic:blipFill>
@@ -109,12 +109,12 @@
             <wp:extent cx="683288" cy="714399"/>
             <wp:effectExtent b="0" l="0" r="0" t="0"/>
             <wp:wrapNone/>
-            <wp:docPr id="3" name="image1.png"/>
+            <wp:docPr id="3" name="image2.png"/>
             <a:graphic>
               <a:graphicData uri="http://schemas.openxmlformats.org/drawingml/2006/picture">
                 <pic:pic>
                   <pic:nvPicPr>
-                    <pic:cNvPr id="0" name="image1.png"/>
+                    <pic:cNvPr id="0" name="image2.png"/>
                     <pic:cNvPicPr preferRelativeResize="0"/>
                   </pic:nvPicPr>
                   <pic:blipFill>

</xml_diff>